<commit_message>
doc(rapport): Ajout de la critique de la planification initial
[20][DONE]
</commit_message>
<xml_diff>
--- a/doc/R-P_FUN-gillhorset-RapportProjet.docx
+++ b/doc/R-P_FUN-gillhorset-RapportProjet.docx
@@ -223,7 +223,7 @@
         </w:rPr>
         <w:fldChar w:fldCharType="separate"/>
       </w:r>
-      <w:hyperlink w:anchor="_Toc239404767" w:history="1">
+      <w:hyperlink w:anchor="_Toc242091913" w:history="1">
         <w:r>
           <w:rPr>
             <w:rStyle w:val="Lienhypertexte"/>
@@ -271,7 +271,7 @@
             <w:noProof/>
             <w:webHidden/>
           </w:rPr>
-          <w:instrText xml:space="preserve"> PAGEREF _Toc239404767 \h </w:instrText>
+          <w:instrText xml:space="preserve"> PAGEREF _Toc242091913 \h </w:instrText>
         </w:r>
         <w:r>
           <w:rPr>
@@ -319,7 +319,7 @@
           <w14:ligatures w14:val="standardContextual"/>
         </w:rPr>
       </w:pPr>
-      <w:hyperlink w:anchor="_Toc239404768" w:history="1">
+      <w:hyperlink w:anchor="_Toc242091914" w:history="1">
         <w:r>
           <w:rPr>
             <w:rStyle w:val="Lienhypertexte"/>
@@ -365,7 +365,7 @@
             <w:noProof/>
             <w:webHidden/>
           </w:rPr>
-          <w:instrText xml:space="preserve"> PAGEREF _Toc239404768 \h </w:instrText>
+          <w:instrText xml:space="preserve"> PAGEREF _Toc242091914 \h </w:instrText>
         </w:r>
         <w:r>
           <w:rPr>
@@ -413,7 +413,7 @@
           <w14:ligatures w14:val="standardContextual"/>
         </w:rPr>
       </w:pPr>
-      <w:hyperlink w:anchor="_Toc239404769" w:history="1">
+      <w:hyperlink w:anchor="_Toc242091915" w:history="1">
         <w:r>
           <w:rPr>
             <w:rStyle w:val="Lienhypertexte"/>
@@ -459,7 +459,7 @@
             <w:noProof/>
             <w:webHidden/>
           </w:rPr>
-          <w:instrText xml:space="preserve"> PAGEREF _Toc239404769 \h </w:instrText>
+          <w:instrText xml:space="preserve"> PAGEREF _Toc242091915 \h </w:instrText>
         </w:r>
         <w:r>
           <w:rPr>
@@ -507,7 +507,7 @@
           <w14:ligatures w14:val="standardContextual"/>
         </w:rPr>
       </w:pPr>
-      <w:hyperlink w:anchor="_Toc239404770" w:history="1">
+      <w:hyperlink w:anchor="_Toc242091916" w:history="1">
         <w:r>
           <w:rPr>
             <w:rStyle w:val="Lienhypertexte"/>
@@ -553,7 +553,7 @@
             <w:noProof/>
             <w:webHidden/>
           </w:rPr>
-          <w:instrText xml:space="preserve"> PAGEREF _Toc239404770 \h </w:instrText>
+          <w:instrText xml:space="preserve"> PAGEREF _Toc242091916 \h </w:instrText>
         </w:r>
         <w:r>
           <w:rPr>
@@ -602,7 +602,7 @@
           <w14:ligatures w14:val="standardContextual"/>
         </w:rPr>
       </w:pPr>
-      <w:hyperlink w:anchor="_Toc239404771" w:history="1">
+      <w:hyperlink w:anchor="_Toc242091917" w:history="1">
         <w:r>
           <w:rPr>
             <w:rStyle w:val="Lienhypertexte"/>
@@ -649,7 +649,7 @@
             <w:noProof/>
             <w:webHidden/>
           </w:rPr>
-          <w:instrText xml:space="preserve"> PAGEREF _Toc239404771 \h </w:instrText>
+          <w:instrText xml:space="preserve"> PAGEREF _Toc242091917 \h </w:instrText>
         </w:r>
         <w:r>
           <w:rPr>
@@ -698,7 +698,7 @@
           <w14:ligatures w14:val="standardContextual"/>
         </w:rPr>
       </w:pPr>
-      <w:hyperlink w:anchor="_Toc239404772" w:history="1">
+      <w:hyperlink w:anchor="_Toc242091918" w:history="1">
         <w:r>
           <w:rPr>
             <w:rStyle w:val="Lienhypertexte"/>
@@ -745,7 +745,7 @@
             <w:noProof/>
             <w:webHidden/>
           </w:rPr>
-          <w:instrText xml:space="preserve"> PAGEREF _Toc239404772 \h </w:instrText>
+          <w:instrText xml:space="preserve"> PAGEREF _Toc242091918 \h </w:instrText>
         </w:r>
         <w:r>
           <w:rPr>
@@ -794,7 +794,7 @@
           <w14:ligatures w14:val="standardContextual"/>
         </w:rPr>
       </w:pPr>
-      <w:hyperlink w:anchor="_Toc239404773" w:history="1">
+      <w:hyperlink w:anchor="_Toc242091919" w:history="1">
         <w:r>
           <w:rPr>
             <w:rStyle w:val="Lienhypertexte"/>
@@ -841,7 +841,7 @@
             <w:noProof/>
             <w:webHidden/>
           </w:rPr>
-          <w:instrText xml:space="preserve"> PAGEREF _Toc239404773 \h </w:instrText>
+          <w:instrText xml:space="preserve"> PAGEREF _Toc242091919 \h </w:instrText>
         </w:r>
         <w:r>
           <w:rPr>
@@ -890,7 +890,7 @@
           <w14:ligatures w14:val="standardContextual"/>
         </w:rPr>
       </w:pPr>
-      <w:hyperlink w:anchor="_Toc239404774" w:history="1">
+      <w:hyperlink w:anchor="_Toc242091920" w:history="1">
         <w:r>
           <w:rPr>
             <w:rStyle w:val="Lienhypertexte"/>
@@ -937,7 +937,7 @@
             <w:noProof/>
             <w:webHidden/>
           </w:rPr>
-          <w:instrText xml:space="preserve"> PAGEREF _Toc239404774 \h </w:instrText>
+          <w:instrText xml:space="preserve"> PAGEREF _Toc242091920 \h </w:instrText>
         </w:r>
         <w:r>
           <w:rPr>
@@ -986,7 +986,7 @@
           <w14:ligatures w14:val="standardContextual"/>
         </w:rPr>
       </w:pPr>
-      <w:hyperlink w:anchor="_Toc239404775" w:history="1">
+      <w:hyperlink w:anchor="_Toc242091921" w:history="1">
         <w:r>
           <w:rPr>
             <w:rStyle w:val="Lienhypertexte"/>
@@ -1033,7 +1033,7 @@
             <w:noProof/>
             <w:webHidden/>
           </w:rPr>
-          <w:instrText xml:space="preserve"> PAGEREF _Toc239404775 \h </w:instrText>
+          <w:instrText xml:space="preserve"> PAGEREF _Toc242091921 \h </w:instrText>
         </w:r>
         <w:r>
           <w:rPr>
@@ -1082,7 +1082,7 @@
           <w14:ligatures w14:val="standardContextual"/>
         </w:rPr>
       </w:pPr>
-      <w:hyperlink w:anchor="_Toc239404776" w:history="1">
+      <w:hyperlink w:anchor="_Toc242091922" w:history="1">
         <w:r>
           <w:rPr>
             <w:rStyle w:val="Lienhypertexte"/>
@@ -1129,7 +1129,7 @@
             <w:noProof/>
             <w:webHidden/>
           </w:rPr>
-          <w:instrText xml:space="preserve"> PAGEREF _Toc239404776 \h </w:instrText>
+          <w:instrText xml:space="preserve"> PAGEREF _Toc242091922 \h </w:instrText>
         </w:r>
         <w:r>
           <w:rPr>
@@ -1178,7 +1178,7 @@
           <w14:ligatures w14:val="standardContextual"/>
         </w:rPr>
       </w:pPr>
-      <w:hyperlink w:anchor="_Toc239404777" w:history="1">
+      <w:hyperlink w:anchor="_Toc242091923" w:history="1">
         <w:r>
           <w:rPr>
             <w:rStyle w:val="Lienhypertexte"/>
@@ -1225,7 +1225,7 @@
             <w:noProof/>
             <w:webHidden/>
           </w:rPr>
-          <w:instrText xml:space="preserve"> PAGEREF _Toc239404777 \h </w:instrText>
+          <w:instrText xml:space="preserve"> PAGEREF _Toc242091923 \h </w:instrText>
         </w:r>
         <w:r>
           <w:rPr>
@@ -1275,7 +1275,7 @@
           <w14:ligatures w14:val="standardContextual"/>
         </w:rPr>
       </w:pPr>
-      <w:hyperlink w:anchor="_Toc239404778" w:history="1">
+      <w:hyperlink w:anchor="_Toc242091924" w:history="1">
         <w:r>
           <w:rPr>
             <w:rStyle w:val="Lienhypertexte"/>
@@ -1323,7 +1323,7 @@
             <w:noProof/>
             <w:webHidden/>
           </w:rPr>
-          <w:instrText xml:space="preserve"> PAGEREF _Toc239404778 \h </w:instrText>
+          <w:instrText xml:space="preserve"> PAGEREF _Toc242091924 \h </w:instrText>
         </w:r>
         <w:r>
           <w:rPr>
@@ -1373,7 +1373,7 @@
           <w14:ligatures w14:val="standardContextual"/>
         </w:rPr>
       </w:pPr>
-      <w:hyperlink w:anchor="_Toc239404779" w:history="1">
+      <w:hyperlink w:anchor="_Toc242091925" w:history="1">
         <w:r>
           <w:rPr>
             <w:rStyle w:val="Lienhypertexte"/>
@@ -1421,7 +1421,7 @@
             <w:noProof/>
             <w:webHidden/>
           </w:rPr>
-          <w:instrText xml:space="preserve"> PAGEREF _Toc239404779 \h </w:instrText>
+          <w:instrText xml:space="preserve"> PAGEREF _Toc242091925 \h </w:instrText>
         </w:r>
         <w:r>
           <w:rPr>
@@ -1469,7 +1469,7 @@
           <w14:ligatures w14:val="standardContextual"/>
         </w:rPr>
       </w:pPr>
-      <w:hyperlink w:anchor="_Toc239404780" w:history="1">
+      <w:hyperlink w:anchor="_Toc242091926" w:history="1">
         <w:r>
           <w:rPr>
             <w:rStyle w:val="Lienhypertexte"/>
@@ -1515,7 +1515,7 @@
             <w:noProof/>
             <w:webHidden/>
           </w:rPr>
-          <w:instrText xml:space="preserve"> PAGEREF _Toc239404780 \h </w:instrText>
+          <w:instrText xml:space="preserve"> PAGEREF _Toc242091926 \h </w:instrText>
         </w:r>
         <w:r>
           <w:rPr>
@@ -1563,7 +1563,7 @@
           <w14:ligatures w14:val="standardContextual"/>
         </w:rPr>
       </w:pPr>
-      <w:hyperlink w:anchor="_Toc239404781" w:history="1">
+      <w:hyperlink w:anchor="_Toc242091927" w:history="1">
         <w:r>
           <w:rPr>
             <w:rStyle w:val="Lienhypertexte"/>
@@ -1609,7 +1609,7 @@
             <w:noProof/>
             <w:webHidden/>
           </w:rPr>
-          <w:instrText xml:space="preserve"> PAGEREF _Toc239404781 \h </w:instrText>
+          <w:instrText xml:space="preserve"> PAGEREF _Toc242091927 \h </w:instrText>
         </w:r>
         <w:r>
           <w:rPr>
@@ -1657,7 +1657,7 @@
           <w14:ligatures w14:val="standardContextual"/>
         </w:rPr>
       </w:pPr>
-      <w:hyperlink w:anchor="_Toc239404782" w:history="1">
+      <w:hyperlink w:anchor="_Toc242091928" w:history="1">
         <w:r>
           <w:rPr>
             <w:rStyle w:val="Lienhypertexte"/>
@@ -1703,7 +1703,7 @@
             <w:noProof/>
             <w:webHidden/>
           </w:rPr>
-          <w:instrText xml:space="preserve"> PAGEREF _Toc239404782 \h </w:instrText>
+          <w:instrText xml:space="preserve"> PAGEREF _Toc242091928 \h </w:instrText>
         </w:r>
         <w:r>
           <w:rPr>
@@ -1751,7 +1751,7 @@
           <w14:ligatures w14:val="standardContextual"/>
         </w:rPr>
       </w:pPr>
-      <w:hyperlink w:anchor="_Toc239404783" w:history="1">
+      <w:hyperlink w:anchor="_Toc242091929" w:history="1">
         <w:r>
           <w:rPr>
             <w:rStyle w:val="Lienhypertexte"/>
@@ -1797,7 +1797,7 @@
             <w:noProof/>
             <w:webHidden/>
           </w:rPr>
-          <w:instrText xml:space="preserve"> PAGEREF _Toc239404783 \h </w:instrText>
+          <w:instrText xml:space="preserve"> PAGEREF _Toc242091929 \h </w:instrText>
         </w:r>
         <w:r>
           <w:rPr>
@@ -1847,7 +1847,7 @@
           <w14:ligatures w14:val="standardContextual"/>
         </w:rPr>
       </w:pPr>
-      <w:hyperlink w:anchor="_Toc239404784" w:history="1">
+      <w:hyperlink w:anchor="_Toc242091930" w:history="1">
         <w:r>
           <w:rPr>
             <w:rStyle w:val="Lienhypertexte"/>
@@ -1895,7 +1895,7 @@
             <w:noProof/>
             <w:webHidden/>
           </w:rPr>
-          <w:instrText xml:space="preserve"> PAGEREF _Toc239404784 \h </w:instrText>
+          <w:instrText xml:space="preserve"> PAGEREF _Toc242091930 \h </w:instrText>
         </w:r>
         <w:r>
           <w:rPr>
@@ -1943,7 +1943,7 @@
           <w14:ligatures w14:val="standardContextual"/>
         </w:rPr>
       </w:pPr>
-      <w:hyperlink w:anchor="_Toc239404785" w:history="1">
+      <w:hyperlink w:anchor="_Toc242091931" w:history="1">
         <w:r>
           <w:rPr>
             <w:rStyle w:val="Lienhypertexte"/>
@@ -1989,7 +1989,7 @@
             <w:noProof/>
             <w:webHidden/>
           </w:rPr>
-          <w:instrText xml:space="preserve"> PAGEREF _Toc239404785 \h </w:instrText>
+          <w:instrText xml:space="preserve"> PAGEREF _Toc242091931 \h </w:instrText>
         </w:r>
         <w:r>
           <w:rPr>
@@ -2037,7 +2037,7 @@
           <w14:ligatures w14:val="standardContextual"/>
         </w:rPr>
       </w:pPr>
-      <w:hyperlink w:anchor="_Toc239404786" w:history="1">
+      <w:hyperlink w:anchor="_Toc242091932" w:history="1">
         <w:r>
           <w:rPr>
             <w:rStyle w:val="Lienhypertexte"/>
@@ -2083,7 +2083,7 @@
             <w:noProof/>
             <w:webHidden/>
           </w:rPr>
-          <w:instrText xml:space="preserve"> PAGEREF _Toc239404786 \h </w:instrText>
+          <w:instrText xml:space="preserve"> PAGEREF _Toc242091932 \h </w:instrText>
         </w:r>
         <w:r>
           <w:rPr>
@@ -2133,7 +2133,7 @@
           <w14:ligatures w14:val="standardContextual"/>
         </w:rPr>
       </w:pPr>
-      <w:hyperlink w:anchor="_Toc239404787" w:history="1">
+      <w:hyperlink w:anchor="_Toc242091933" w:history="1">
         <w:r>
           <w:rPr>
             <w:rStyle w:val="Lienhypertexte"/>
@@ -2181,7 +2181,7 @@
             <w:noProof/>
             <w:webHidden/>
           </w:rPr>
-          <w:instrText xml:space="preserve"> PAGEREF _Toc239404787 \h </w:instrText>
+          <w:instrText xml:space="preserve"> PAGEREF _Toc242091933 \h </w:instrText>
         </w:r>
         <w:r>
           <w:rPr>
@@ -2229,7 +2229,7 @@
           <w14:ligatures w14:val="standardContextual"/>
         </w:rPr>
       </w:pPr>
-      <w:hyperlink w:anchor="_Toc239404788" w:history="1">
+      <w:hyperlink w:anchor="_Toc242091934" w:history="1">
         <w:r>
           <w:rPr>
             <w:rStyle w:val="Lienhypertexte"/>
@@ -2275,7 +2275,7 @@
             <w:noProof/>
             <w:webHidden/>
           </w:rPr>
-          <w:instrText xml:space="preserve"> PAGEREF _Toc239404788 \h </w:instrText>
+          <w:instrText xml:space="preserve"> PAGEREF _Toc242091934 \h </w:instrText>
         </w:r>
         <w:r>
           <w:rPr>
@@ -2325,7 +2325,7 @@
           <w14:ligatures w14:val="standardContextual"/>
         </w:rPr>
       </w:pPr>
-      <w:hyperlink w:anchor="_Toc239404789" w:history="1">
+      <w:hyperlink w:anchor="_Toc242091935" w:history="1">
         <w:r>
           <w:rPr>
             <w:rStyle w:val="Lienhypertexte"/>
@@ -2373,7 +2373,7 @@
             <w:noProof/>
             <w:webHidden/>
           </w:rPr>
-          <w:instrText xml:space="preserve"> PAGEREF _Toc239404789 \h </w:instrText>
+          <w:instrText xml:space="preserve"> PAGEREF _Toc242091935 \h </w:instrText>
         </w:r>
         <w:r>
           <w:rPr>
@@ -2421,7 +2421,7 @@
           <w14:ligatures w14:val="standardContextual"/>
         </w:rPr>
       </w:pPr>
-      <w:hyperlink w:anchor="_Toc239404790" w:history="1">
+      <w:hyperlink w:anchor="_Toc242091936" w:history="1">
         <w:r>
           <w:rPr>
             <w:rStyle w:val="Lienhypertexte"/>
@@ -2467,7 +2467,7 @@
             <w:noProof/>
             <w:webHidden/>
           </w:rPr>
-          <w:instrText xml:space="preserve"> PAGEREF _Toc239404790 \h </w:instrText>
+          <w:instrText xml:space="preserve"> PAGEREF _Toc242091936 \h </w:instrText>
         </w:r>
         <w:r>
           <w:rPr>
@@ -2515,7 +2515,7 @@
           <w14:ligatures w14:val="standardContextual"/>
         </w:rPr>
       </w:pPr>
-      <w:hyperlink w:anchor="_Toc239404791" w:history="1">
+      <w:hyperlink w:anchor="_Toc242091937" w:history="1">
         <w:r>
           <w:rPr>
             <w:rStyle w:val="Lienhypertexte"/>
@@ -2561,7 +2561,7 @@
             <w:noProof/>
             <w:webHidden/>
           </w:rPr>
-          <w:instrText xml:space="preserve"> PAGEREF _Toc239404791 \h </w:instrText>
+          <w:instrText xml:space="preserve"> PAGEREF _Toc242091937 \h </w:instrText>
         </w:r>
         <w:r>
           <w:rPr>
@@ -2609,7 +2609,7 @@
           <w14:ligatures w14:val="standardContextual"/>
         </w:rPr>
       </w:pPr>
-      <w:hyperlink w:anchor="_Toc239404792" w:history="1">
+      <w:hyperlink w:anchor="_Toc242091938" w:history="1">
         <w:r>
           <w:rPr>
             <w:rStyle w:val="Lienhypertexte"/>
@@ -2655,7 +2655,7 @@
             <w:noProof/>
             <w:webHidden/>
           </w:rPr>
-          <w:instrText xml:space="preserve"> PAGEREF _Toc239404792 \h </w:instrText>
+          <w:instrText xml:space="preserve"> PAGEREF _Toc242091938 \h </w:instrText>
         </w:r>
         <w:r>
           <w:rPr>
@@ -2705,7 +2705,7 @@
           <w14:ligatures w14:val="standardContextual"/>
         </w:rPr>
       </w:pPr>
-      <w:hyperlink w:anchor="_Toc239404793" w:history="1">
+      <w:hyperlink w:anchor="_Toc242091939" w:history="1">
         <w:r>
           <w:rPr>
             <w:rStyle w:val="Lienhypertexte"/>
@@ -2753,7 +2753,7 @@
             <w:noProof/>
             <w:webHidden/>
           </w:rPr>
-          <w:instrText xml:space="preserve"> PAGEREF _Toc239404793 \h </w:instrText>
+          <w:instrText xml:space="preserve"> PAGEREF _Toc242091939 \h </w:instrText>
         </w:r>
         <w:r>
           <w:rPr>
@@ -2801,7 +2801,7 @@
           <w14:ligatures w14:val="standardContextual"/>
         </w:rPr>
       </w:pPr>
-      <w:hyperlink w:anchor="_Toc239404794" w:history="1">
+      <w:hyperlink w:anchor="_Toc242091940" w:history="1">
         <w:r>
           <w:rPr>
             <w:rStyle w:val="Lienhypertexte"/>
@@ -2847,7 +2847,7 @@
             <w:noProof/>
             <w:webHidden/>
           </w:rPr>
-          <w:instrText xml:space="preserve"> PAGEREF _Toc239404794 \h </w:instrText>
+          <w:instrText xml:space="preserve"> PAGEREF _Toc242091940 \h </w:instrText>
         </w:r>
         <w:r>
           <w:rPr>
@@ -2895,7 +2895,7 @@
           <w14:ligatures w14:val="standardContextual"/>
         </w:rPr>
       </w:pPr>
-      <w:hyperlink w:anchor="_Toc239404795" w:history="1">
+      <w:hyperlink w:anchor="_Toc242091941" w:history="1">
         <w:r>
           <w:rPr>
             <w:rStyle w:val="Lienhypertexte"/>
@@ -2941,7 +2941,7 @@
             <w:noProof/>
             <w:webHidden/>
           </w:rPr>
-          <w:instrText xml:space="preserve"> PAGEREF _Toc239404795 \h </w:instrText>
+          <w:instrText xml:space="preserve"> PAGEREF _Toc242091941 \h </w:instrText>
         </w:r>
         <w:r>
           <w:rPr>
@@ -2961,7 +2961,7 @@
             <w:noProof/>
             <w:webHidden/>
           </w:rPr>
-          <w:t>11</w:t>
+          <w:t>12</w:t>
         </w:r>
         <w:r>
           <w:rPr>
@@ -2989,7 +2989,7 @@
           <w14:ligatures w14:val="standardContextual"/>
         </w:rPr>
       </w:pPr>
-      <w:hyperlink w:anchor="_Toc239404796" w:history="1">
+      <w:hyperlink w:anchor="_Toc242091942" w:history="1">
         <w:r>
           <w:rPr>
             <w:rStyle w:val="Lienhypertexte"/>
@@ -3035,7 +3035,7 @@
             <w:noProof/>
             <w:webHidden/>
           </w:rPr>
-          <w:instrText xml:space="preserve"> PAGEREF _Toc239404796 \h </w:instrText>
+          <w:instrText xml:space="preserve"> PAGEREF _Toc242091942 \h </w:instrText>
         </w:r>
         <w:r>
           <w:rPr>
@@ -3055,7 +3055,7 @@
             <w:noProof/>
             <w:webHidden/>
           </w:rPr>
-          <w:t>11</w:t>
+          <w:t>12</w:t>
         </w:r>
         <w:r>
           <w:rPr>
@@ -3085,7 +3085,7 @@
           <w14:ligatures w14:val="standardContextual"/>
         </w:rPr>
       </w:pPr>
-      <w:hyperlink w:anchor="_Toc239404797" w:history="1">
+      <w:hyperlink w:anchor="_Toc242091943" w:history="1">
         <w:r>
           <w:rPr>
             <w:rStyle w:val="Lienhypertexte"/>
@@ -3133,7 +3133,7 @@
             <w:noProof/>
             <w:webHidden/>
           </w:rPr>
-          <w:instrText xml:space="preserve"> PAGEREF _Toc239404797 \h </w:instrText>
+          <w:instrText xml:space="preserve"> PAGEREF _Toc242091943 \h </w:instrText>
         </w:r>
         <w:r>
           <w:rPr>
@@ -3153,7 +3153,7 @@
             <w:noProof/>
             <w:webHidden/>
           </w:rPr>
-          <w:t>11</w:t>
+          <w:t>12</w:t>
         </w:r>
         <w:r>
           <w:rPr>
@@ -3186,7 +3186,7 @@
       </w:pPr>
       <w:bookmarkStart w:id="0" w:name="_Toc532179955"/>
       <w:bookmarkStart w:id="1" w:name="_Toc165969637"/>
-      <w:bookmarkStart w:id="2" w:name="_Toc239404767"/>
+      <w:bookmarkStart w:id="2" w:name="_Toc242091913"/>
       <w:r>
         <w:lastRenderedPageBreak/>
         <w:t>Spécifications</w:t>
@@ -3206,7 +3206,7 @@
       </w:pPr>
       <w:bookmarkStart w:id="3" w:name="_Toc532179969"/>
       <w:bookmarkStart w:id="4" w:name="_Toc165969639"/>
-      <w:bookmarkStart w:id="5" w:name="_Toc239404768"/>
+      <w:bookmarkStart w:id="5" w:name="_Toc242091914"/>
       <w:r>
         <w:t>Introduction</w:t>
       </w:r>
@@ -3241,7 +3241,7 @@
       <w:pPr>
         <w:pStyle w:val="Titre2"/>
       </w:pPr>
-      <w:bookmarkStart w:id="6" w:name="_Toc239404769"/>
+      <w:bookmarkStart w:id="6" w:name="_Toc242091915"/>
       <w:r>
         <w:t>Matériel et logiciels à disposition</w:t>
       </w:r>
@@ -3316,7 +3316,7 @@
       <w:pPr>
         <w:pStyle w:val="Titre2"/>
       </w:pPr>
-      <w:bookmarkStart w:id="7" w:name="_Toc239404770"/>
+      <w:bookmarkStart w:id="7" w:name="_Toc242091916"/>
       <w:r>
         <w:t>Cahier des charges</w:t>
       </w:r>
@@ -3326,7 +3326,7 @@
       <w:pPr>
         <w:pStyle w:val="Titre3"/>
       </w:pPr>
-      <w:bookmarkStart w:id="8" w:name="_Toc239404771"/>
+      <w:bookmarkStart w:id="8" w:name="_Toc242091917"/>
       <w:r>
         <w:t xml:space="preserve">Objectifs </w:t>
       </w:r>
@@ -3361,7 +3361,7 @@
       <w:pPr>
         <w:pStyle w:val="Titre3"/>
       </w:pPr>
-      <w:bookmarkStart w:id="9" w:name="_Toc239404772"/>
+      <w:bookmarkStart w:id="9" w:name="_Toc242091918"/>
       <w:r>
         <w:t>Objectif pédagogique</w:t>
       </w:r>
@@ -3394,7 +3394,7 @@
       <w:pPr>
         <w:pStyle w:val="Titre3"/>
       </w:pPr>
-      <w:bookmarkStart w:id="10" w:name="_Toc239404773"/>
+      <w:bookmarkStart w:id="10" w:name="_Toc242091919"/>
       <w:r>
         <w:t>Analyse fonctionnelle</w:t>
       </w:r>
@@ -4987,7 +4987,7 @@
       <w:pPr>
         <w:pStyle w:val="Titre3"/>
       </w:pPr>
-      <w:bookmarkStart w:id="11" w:name="_Toc239404774"/>
+      <w:bookmarkStart w:id="11" w:name="_Toc242091920"/>
       <w:r>
         <w:t>Contraintes</w:t>
       </w:r>
@@ -5027,7 +5027,7 @@
       <w:pPr>
         <w:pStyle w:val="Titre3"/>
       </w:pPr>
-      <w:bookmarkStart w:id="12" w:name="_Toc239404775"/>
+      <w:bookmarkStart w:id="12" w:name="_Toc242091921"/>
       <w:r>
         <w:t>Travail à réaliser par l'apprenti</w:t>
       </w:r>
@@ -5061,7 +5061,7 @@
       <w:pPr>
         <w:pStyle w:val="Titre3"/>
       </w:pPr>
-      <w:bookmarkStart w:id="13" w:name="_Toc239404776"/>
+      <w:bookmarkStart w:id="13" w:name="_Toc242091922"/>
       <w:r>
         <w:t>Si le temps le permet …</w:t>
       </w:r>
@@ -5103,7 +5103,7 @@
       <w:pPr>
         <w:pStyle w:val="Titre3"/>
       </w:pPr>
-      <w:bookmarkStart w:id="14" w:name="_Toc239404777"/>
+      <w:bookmarkStart w:id="14" w:name="_Toc242091923"/>
       <w:r>
         <w:lastRenderedPageBreak/>
         <w:t>Méthodes de validation des solutions</w:t>
@@ -5153,7 +5153,7 @@
       <w:pPr>
         <w:pStyle w:val="Titre1"/>
       </w:pPr>
-      <w:bookmarkStart w:id="15" w:name="_Toc239404778"/>
+      <w:bookmarkStart w:id="15" w:name="_Toc242091924"/>
       <w:r>
         <w:t>Planification</w:t>
       </w:r>
@@ -5310,7 +5310,7 @@
       </w:pPr>
       <w:bookmarkStart w:id="16" w:name="_Toc532179957"/>
       <w:bookmarkStart w:id="17" w:name="_Toc165969641"/>
-      <w:bookmarkStart w:id="18" w:name="_Toc239404779"/>
+      <w:bookmarkStart w:id="18" w:name="_Toc242091925"/>
       <w:r>
         <w:t>Analyse</w:t>
       </w:r>
@@ -5322,7 +5322,7 @@
       <w:pPr>
         <w:pStyle w:val="Titre2"/>
       </w:pPr>
-      <w:bookmarkStart w:id="19" w:name="_Toc239404780"/>
+      <w:bookmarkStart w:id="19" w:name="_Toc242091926"/>
       <w:r>
         <w:t>Opportunités</w:t>
       </w:r>
@@ -5451,7 +5451,7 @@
       </w:pPr>
       <w:bookmarkStart w:id="20" w:name="_Toc532179959"/>
       <w:bookmarkStart w:id="21" w:name="_Toc165969643"/>
-      <w:bookmarkStart w:id="22" w:name="_Toc239404781"/>
+      <w:bookmarkStart w:id="22" w:name="_Toc242091927"/>
       <w:r>
         <w:t>Document d’analyse</w:t>
       </w:r>
@@ -5631,7 +5631,7 @@
       </w:pPr>
       <w:bookmarkStart w:id="23" w:name="_Toc532179967"/>
       <w:bookmarkStart w:id="24" w:name="_Toc165969651"/>
-      <w:bookmarkStart w:id="25" w:name="_Toc239404782"/>
+      <w:bookmarkStart w:id="25" w:name="_Toc242091928"/>
       <w:r>
         <w:t>Conception des tests</w:t>
       </w:r>
@@ -5689,7 +5689,7 @@
         <w:pStyle w:val="Titre2"/>
       </w:pPr>
       <w:bookmarkStart w:id="26" w:name="_Toc532179961"/>
-      <w:bookmarkStart w:id="27" w:name="_Toc239404783"/>
+      <w:bookmarkStart w:id="27" w:name="_Toc242091929"/>
       <w:r>
         <w:t>Planification</w:t>
       </w:r>
@@ -5737,7 +5737,7 @@
       </w:pPr>
       <w:bookmarkStart w:id="28" w:name="_Toc532179964"/>
       <w:bookmarkStart w:id="29" w:name="_Toc165969648"/>
-      <w:bookmarkStart w:id="30" w:name="_Toc239404784"/>
+      <w:bookmarkStart w:id="30" w:name="_Toc242091930"/>
       <w:bookmarkEnd w:id="26"/>
       <w:r>
         <w:t>Réalisation</w:t>
@@ -5752,7 +5752,7 @@
       </w:pPr>
       <w:bookmarkStart w:id="31" w:name="_Toc532179965"/>
       <w:bookmarkStart w:id="32" w:name="_Toc165969649"/>
-      <w:bookmarkStart w:id="33" w:name="_Toc239404785"/>
+      <w:bookmarkStart w:id="33" w:name="_Toc242091931"/>
       <w:r>
         <w:t>Dossier de Réalisation</w:t>
       </w:r>
@@ -5919,7 +5919,7 @@
       </w:pPr>
       <w:bookmarkStart w:id="34" w:name="_Toc532179960"/>
       <w:bookmarkStart w:id="35" w:name="_Toc165969644"/>
-      <w:bookmarkStart w:id="36" w:name="_Toc239404786"/>
+      <w:bookmarkStart w:id="36" w:name="_Toc242091932"/>
       <w:r>
         <w:lastRenderedPageBreak/>
         <w:t>Modifications</w:t>
@@ -5970,7 +5970,7 @@
       </w:pPr>
       <w:bookmarkStart w:id="37" w:name="_Toc532179966"/>
       <w:bookmarkStart w:id="38" w:name="_Toc165969650"/>
-      <w:bookmarkStart w:id="39" w:name="_Toc239404787"/>
+      <w:bookmarkStart w:id="39" w:name="_Toc242091933"/>
       <w:r>
         <w:t>Tests</w:t>
       </w:r>
@@ -5985,7 +5985,7 @@
       <w:bookmarkStart w:id="40" w:name="_Toc532179968"/>
       <w:bookmarkStart w:id="41" w:name="_Toc165969652"/>
       <w:bookmarkStart w:id="42" w:name="_Ref308525868"/>
-      <w:bookmarkStart w:id="43" w:name="_Toc239404788"/>
+      <w:bookmarkStart w:id="43" w:name="_Toc242091934"/>
       <w:r>
         <w:t>Dossier des tests</w:t>
       </w:r>
@@ -6090,7 +6090,7 @@
         <w:pStyle w:val="Titre1"/>
       </w:pPr>
       <w:bookmarkStart w:id="44" w:name="_Toc165969653"/>
-      <w:bookmarkStart w:id="45" w:name="_Toc239404789"/>
+      <w:bookmarkStart w:id="45" w:name="_Toc242091935"/>
       <w:r>
         <w:t>Conclusion</w:t>
       </w:r>
@@ -6102,7 +6102,7 @@
         <w:pStyle w:val="Titre2"/>
       </w:pPr>
       <w:bookmarkStart w:id="46" w:name="_Toc165969654"/>
-      <w:bookmarkStart w:id="47" w:name="_Toc239404790"/>
+      <w:bookmarkStart w:id="47" w:name="_Toc242091936"/>
       <w:r>
         <w:t xml:space="preserve">Bilan des </w:t>
       </w:r>
@@ -6150,12 +6150,89 @@
         <w:pStyle w:val="Titre2"/>
       </w:pPr>
       <w:bookmarkStart w:id="48" w:name="_Toc165969655"/>
-      <w:bookmarkStart w:id="49" w:name="_Toc239404791"/>
+      <w:bookmarkStart w:id="49" w:name="_Toc242091937"/>
       <w:r>
         <w:t>Bilan de la planification</w:t>
       </w:r>
       <w:bookmarkEnd w:id="48"/>
       <w:bookmarkEnd w:id="49"/>
+    </w:p>
+    <w:p>
+      <w:pPr>
+        <w:pStyle w:val="Retraitcorpsdetexte"/>
+      </w:pPr>
+      <w:r>
+        <w:t>La planification s’est avérée fausse dès la première semaine.</w:t>
+      </w:r>
+    </w:p>
+    <w:p>
+      <w:pPr>
+        <w:pStyle w:val="Retraitcorpsdetexte"/>
+      </w:pPr>
+      <w:r>
+        <w:t>Je pensais pouvoir commencer par l’affichage des données avec des données de testes inscrites en dure, mais après avoir fait un Frontend de base, il s’est avérer que à la place de perdre du temps à créer et importer des données de testes qui seront supprimer plus tard, j’ai décidé de passer à l’importation des données. Cela m’a permis de passer la première et la deuxième semaine sur l’importation des données.</w:t>
+      </w:r>
+    </w:p>
+    <w:p>
+      <w:pPr>
+        <w:pStyle w:val="Retraitcorpsdetexte"/>
+      </w:pPr>
+      <w:r>
+        <w:t>Durant la deuxième semaine je pensais faire l’affichage de la légende mais j’était occuper à finaliser et tester l’importation des données, donc je l’ai décalé.</w:t>
+      </w:r>
+    </w:p>
+    <w:p>
+      <w:pPr>
+        <w:pStyle w:val="Retraitcorpsdetexte"/>
+      </w:pPr>
+      <w:r>
+        <w:t xml:space="preserve">En ce qui concerne la troisième semaine, je n’avais pas prévu ça, mais le 21 septembre était le lundi du jeune, donc je n’ai pas </w:t>
+      </w:r>
+      <w:r>
+        <w:t>travaillé</w:t>
+      </w:r>
+      <w:r>
+        <w:t>.</w:t>
+      </w:r>
+    </w:p>
+    <w:p>
+      <w:pPr>
+        <w:pStyle w:val="Retraitcorpsdetexte"/>
+      </w:pPr>
+      <w:r>
+        <w:t>Pour la quatrième semaine j’ai commencé par travailler sur la fin de l’importation des données et de leurs affichages puis je suis passé à l’affichage de la légende qui m’a pris moins de temps que prévu, donc j’ai pu le terminer dans la même semaine.</w:t>
+      </w:r>
+    </w:p>
+    <w:p>
+      <w:pPr>
+        <w:pStyle w:val="Retraitcorpsdetexte"/>
+      </w:pPr>
+      <w:r>
+        <w:t xml:space="preserve">Pour la cinquième semaine </w:t>
+      </w:r>
+      <w:r>
+        <w:t xml:space="preserve">j’ai réalisé qu’il y avait un problème lors de l’importation des données. J’avait mis dans mes </w:t>
+      </w:r>
+      <w:proofErr w:type="spellStart"/>
+      <w:r>
+        <w:t>users</w:t>
+      </w:r>
+      <w:proofErr w:type="spellEnd"/>
+      <w:r>
+        <w:t xml:space="preserve"> stories que les données importées en doublons écrasaient celle présente en DB. Point que j’ai passé toute la séance à corriger.</w:t>
+      </w:r>
+    </w:p>
+    <w:p>
+      <w:pPr>
+        <w:pStyle w:val="Titre2"/>
+      </w:pPr>
+      <w:bookmarkStart w:id="50" w:name="_Toc165969656"/>
+      <w:bookmarkStart w:id="51" w:name="_Toc242091938"/>
+      <w:r>
+        <w:t>Bilan personnel</w:t>
+      </w:r>
+      <w:bookmarkEnd w:id="50"/>
+      <w:bookmarkEnd w:id="51"/>
     </w:p>
     <w:p>
       <w:pPr>
@@ -6166,43 +6243,61 @@
         </w:numPr>
       </w:pPr>
       <w:r>
-        <w:t xml:space="preserve">Distinguer </w:t>
-      </w:r>
-      <w:r>
-        <w:t xml:space="preserve">et expliquer </w:t>
-      </w:r>
-      <w:r>
-        <w:t xml:space="preserve">les tâches qui ont généré des retards ou de l'avance dans la </w:t>
-      </w:r>
-      <w:r>
-        <w:t>gestion du</w:t>
-      </w:r>
-      <w:r>
-        <w:t xml:space="preserve"> projet.</w:t>
-      </w:r>
-      <w:r>
-        <w:t xml:space="preserve"> Indiquer </w:t>
+        <w:t xml:space="preserve">Si c’était à </w:t>
       </w:r>
       <w:proofErr w:type="gramStart"/>
       <w:r>
-        <w:t>les différence</w:t>
+        <w:t>refaire</w:t>
+      </w:r>
+      <w:r>
+        <w:t>:</w:t>
       </w:r>
       <w:proofErr w:type="gramEnd"/>
-      <w:r>
-        <w:t xml:space="preserve"> entre les planifications initiales et détaillées avec le journal de travail.</w:t>
-      </w:r>
-    </w:p>
-    <w:p>
-      <w:pPr>
-        <w:pStyle w:val="Titre2"/>
-      </w:pPr>
-      <w:bookmarkStart w:id="50" w:name="_Toc165969656"/>
-      <w:bookmarkStart w:id="51" w:name="_Toc239404792"/>
-      <w:r>
-        <w:t>Bilan personnel</w:t>
-      </w:r>
-      <w:bookmarkEnd w:id="50"/>
-      <w:bookmarkEnd w:id="51"/>
+    </w:p>
+    <w:p>
+      <w:pPr>
+        <w:pStyle w:val="Informations"/>
+        <w:numPr>
+          <w:ilvl w:val="6"/>
+          <w:numId w:val="24"/>
+        </w:numPr>
+      </w:pPr>
+      <w:r>
+        <w:t>Q</w:t>
+      </w:r>
+      <w:r>
+        <w:t xml:space="preserve">u’est-ce </w:t>
+      </w:r>
+      <w:r>
+        <w:t>qu’il faudrait garder</w:t>
+      </w:r>
+      <w:r>
+        <w:t> </w:t>
+      </w:r>
+      <w:r>
+        <w:t>? Les</w:t>
+      </w:r>
+      <w:r>
+        <w:t xml:space="preserve"> plus et les moins ?</w:t>
+      </w:r>
+    </w:p>
+    <w:p>
+      <w:pPr>
+        <w:pStyle w:val="Informations"/>
+        <w:numPr>
+          <w:ilvl w:val="6"/>
+          <w:numId w:val="24"/>
+        </w:numPr>
+      </w:pPr>
+      <w:r>
+        <w:t>Q</w:t>
+      </w:r>
+      <w:r>
+        <w:t xml:space="preserve">u’est-ce </w:t>
+      </w:r>
+      <w:r>
+        <w:t>qu’il faudrait gérer, réaliser ou traiter différemment ?</w:t>
+      </w:r>
     </w:p>
     <w:p>
       <w:pPr>
@@ -6213,60 +6308,7 @@
         </w:numPr>
       </w:pPr>
       <w:r>
-        <w:t xml:space="preserve">Si c’était à </w:t>
-      </w:r>
-      <w:proofErr w:type="gramStart"/>
-      <w:r>
-        <w:t>refaire</w:t>
-      </w:r>
-      <w:r>
-        <w:t>:</w:t>
-      </w:r>
-      <w:proofErr w:type="gramEnd"/>
-    </w:p>
-    <w:p>
-      <w:pPr>
-        <w:pStyle w:val="Informations"/>
-        <w:numPr>
-          <w:ilvl w:val="6"/>
-          <w:numId w:val="24"/>
-        </w:numPr>
-      </w:pPr>
-      <w:r>
-        <w:t>Q</w:t>
-      </w:r>
-      <w:r>
-        <w:t xml:space="preserve">u’est-ce </w:t>
-      </w:r>
-      <w:r>
-        <w:t>qu’il faudrait garder</w:t>
-      </w:r>
-      <w:r>
-        <w:t> </w:t>
-      </w:r>
-      <w:r>
-        <w:t>? Les</w:t>
-      </w:r>
-      <w:r>
-        <w:t xml:space="preserve"> plus et les moins ?</w:t>
-      </w:r>
-    </w:p>
-    <w:p>
-      <w:pPr>
-        <w:pStyle w:val="Informations"/>
-        <w:numPr>
-          <w:ilvl w:val="6"/>
-          <w:numId w:val="24"/>
-        </w:numPr>
-      </w:pPr>
-      <w:r>
-        <w:t>Q</w:t>
-      </w:r>
-      <w:r>
-        <w:t xml:space="preserve">u’est-ce </w:t>
-      </w:r>
-      <w:r>
-        <w:t>qu’il faudrait gérer, réaliser ou traiter différemment ?</w:t>
+        <w:t>Qu’est que ce projet m’a appris ?</w:t>
       </w:r>
     </w:p>
     <w:p>
@@ -6278,7 +6320,7 @@
         </w:numPr>
       </w:pPr>
       <w:r>
-        <w:t>Qu’est que ce projet m’a appris ?</w:t>
+        <w:t>Suite à donner, améliorations souhaitables, …</w:t>
       </w:r>
     </w:p>
     <w:p>
@@ -6290,18 +6332,6 @@
         </w:numPr>
       </w:pPr>
       <w:r>
-        <w:t>Suite à donner, améliorations souhaitables, …</w:t>
-      </w:r>
-    </w:p>
-    <w:p>
-      <w:pPr>
-        <w:pStyle w:val="Informations"/>
-        <w:numPr>
-          <w:ilvl w:val="5"/>
-          <w:numId w:val="24"/>
-        </w:numPr>
-      </w:pPr>
-      <w:r>
         <w:t>Remerciements, signature, etc.</w:t>
       </w:r>
     </w:p>
@@ -6311,7 +6341,7 @@
       </w:pPr>
       <w:bookmarkStart w:id="52" w:name="_Toc532179971"/>
       <w:bookmarkStart w:id="53" w:name="_Toc165969657"/>
-      <w:bookmarkStart w:id="54" w:name="_Toc239404793"/>
+      <w:bookmarkStart w:id="54" w:name="_Toc242091939"/>
       <w:r>
         <w:t>Divers</w:t>
       </w:r>
@@ -6325,7 +6355,7 @@
       </w:pPr>
       <w:bookmarkStart w:id="55" w:name="_Toc532179972"/>
       <w:bookmarkStart w:id="56" w:name="_Toc165969658"/>
-      <w:bookmarkStart w:id="57" w:name="_Toc239404794"/>
+      <w:bookmarkStart w:id="57" w:name="_Toc242091940"/>
       <w:r>
         <w:t>Journal de travail</w:t>
       </w:r>
@@ -6367,8 +6397,9 @@
       <w:pPr>
         <w:pStyle w:val="Titre2"/>
       </w:pPr>
-      <w:bookmarkStart w:id="58" w:name="_Toc239404795"/>
-      <w:r>
+      <w:bookmarkStart w:id="58" w:name="_Toc242091941"/>
+      <w:r>
+        <w:lastRenderedPageBreak/>
         <w:t>Bibliographie</w:t>
       </w:r>
       <w:bookmarkEnd w:id="58"/>
@@ -6398,7 +6429,7 @@
       <w:pPr>
         <w:pStyle w:val="Titre2"/>
       </w:pPr>
-      <w:bookmarkStart w:id="59" w:name="_Toc239404796"/>
+      <w:bookmarkStart w:id="59" w:name="_Toc242091942"/>
       <w:r>
         <w:t>Webographie</w:t>
       </w:r>
@@ -6420,7 +6451,7 @@
       <w:pPr>
         <w:pStyle w:val="Titre1"/>
       </w:pPr>
-      <w:bookmarkStart w:id="60" w:name="_Toc239404797"/>
+      <w:bookmarkStart w:id="60" w:name="_Toc242091943"/>
       <w:r>
         <w:t>Annexes</w:t>
       </w:r>
@@ -6982,7 +7013,7 @@
               <w:noProof/>
               <w:szCs w:val="16"/>
             </w:rPr>
-            <w:t>02.09.2026 16:31</w:t>
+            <w:t>04.09.2026 08:59</w:t>
           </w:r>
           <w:r>
             <w:rPr>
@@ -7194,7 +7225,7 @@
         <v:path o:extrusionok="f" gradientshapeok="t" o:connecttype="rect"/>
         <o:lock v:ext="edit" aspectratio="t"/>
       </v:shapetype>
-      <v:shape id="_x0000_i1025" type="#_x0000_t75" style="width:12pt;height:12pt" o:bullet="t">
+      <v:shape id="_x0000_i1025" type="#_x0000_t75" style="width:12.25pt;height:12.25pt" o:bullet="t">
         <v:imagedata r:id="rId1" o:title="BD10263_"/>
       </v:shape>
     </w:pict>
@@ -12136,10 +12167,6 @@
 </file>
 
 <file path=customXml/item1.xml><?xml version="1.0" encoding="utf-8"?>
-<b:Sources xmlns:b="http://schemas.openxmlformats.org/officeDocument/2006/bibliography" xmlns="http://schemas.openxmlformats.org/officeDocument/2006/bibliography" SelectedStyle="\APA.XSL" StyleName="APA"/>
-</file>
-
-<file path=customXml/item2.xml><?xml version="1.0" encoding="utf-8"?>
 <p:properties xmlns:p="http://schemas.microsoft.com/office/2006/metadata/properties" xmlns:xsi="http://www.w3.org/2001/XMLSchema-instance" xmlns:pc="http://schemas.microsoft.com/office/infopath/2007/PartnerControls">
   <documentManagement>
     <lcf76f155ced4ddcb4097134ff3c332f xmlns="a1b10758-7132-46a4-a2fe-7a2cf46f51f4">
@@ -12150,7 +12177,20 @@
 </p:properties>
 </file>
 
+<file path=customXml/item2.xml><?xml version="1.0" encoding="utf-8"?>
+<b:Sources xmlns:b="http://schemas.openxmlformats.org/officeDocument/2006/bibliography" xmlns="http://schemas.openxmlformats.org/officeDocument/2006/bibliography" SelectedStyle="\APA.XSL" StyleName="APA"/>
+</file>
+
 <file path=customXml/item3.xml><?xml version="1.0" encoding="utf-8"?>
+<?mso-contentType ?>
+<FormTemplates xmlns="http://schemas.microsoft.com/sharepoint/v3/contenttype/forms">
+  <Display>DocumentLibraryForm</Display>
+  <Edit>DocumentLibraryForm</Edit>
+  <New>DocumentLibraryForm</New>
+</FormTemplates>
+</file>
+
+<file path=customXml/item4.xml><?xml version="1.0" encoding="utf-8"?>
 <ct:contentTypeSchema xmlns:ct="http://schemas.microsoft.com/office/2006/metadata/contentType" xmlns:ma="http://schemas.microsoft.com/office/2006/metadata/properties/metaAttributes" ct:_="" ma:_="" ma:contentTypeName="Document" ma:contentTypeID="0x0101005A5B8F5EAAC22C48A11F5D9A60E6F21D" ma:contentTypeVersion="16" ma:contentTypeDescription="Crée un document." ma:contentTypeScope="" ma:versionID="f2b963976306cc54294b7f4545a3c6c4">
   <xsd:schema xmlns:xsd="http://www.w3.org/2001/XMLSchema" xmlns:xs="http://www.w3.org/2001/XMLSchema" xmlns:p="http://schemas.microsoft.com/office/2006/metadata/properties" xmlns:ns2="a1b10758-7132-46a4-a2fe-7a2cf46f51f4" xmlns:ns3="f7d9f5a6-831d-4621-8c77-cbcaf993e406" targetNamespace="http://schemas.microsoft.com/office/2006/metadata/properties" ma:root="true" ma:fieldsID="e5e135fa2fc1295e1586ddcd9c1a8904" ns2:_="" ns3:_="">
     <xsd:import namespace="a1b10758-7132-46a4-a2fe-7a2cf46f51f4"/>
@@ -12393,24 +12433,7 @@
 </ct:contentTypeSchema>
 </file>
 
-<file path=customXml/item4.xml><?xml version="1.0" encoding="utf-8"?>
-<?mso-contentType ?>
-<FormTemplates xmlns="http://schemas.microsoft.com/sharepoint/v3/contenttype/forms">
-  <Display>DocumentLibraryForm</Display>
-  <Edit>DocumentLibraryForm</Edit>
-  <New>DocumentLibraryForm</New>
-</FormTemplates>
-</file>
-
 <file path=customXml/itemProps1.xml><?xml version="1.0" encoding="utf-8"?>
-<ds:datastoreItem xmlns:ds="http://schemas.openxmlformats.org/officeDocument/2006/customXml" ds:itemID="{C8C35155-3E6A-4058-B6E4-303717845E3B}">
-  <ds:schemaRefs>
-    <ds:schemaRef ds:uri="http://schemas.openxmlformats.org/officeDocument/2006/bibliography"/>
-  </ds:schemaRefs>
-</ds:datastoreItem>
-</file>
-
-<file path=customXml/itemProps2.xml><?xml version="1.0" encoding="utf-8"?>
 <ds:datastoreItem xmlns:ds="http://schemas.openxmlformats.org/officeDocument/2006/customXml" ds:itemID="{2319CDB8-A2CD-412D-8359-13E6B4DF1FF4}">
   <ds:schemaRefs>
     <ds:schemaRef ds:uri="http://schemas.microsoft.com/office/2006/metadata/properties"/>
@@ -12421,7 +12444,23 @@
 </ds:datastoreItem>
 </file>
 
+<file path=customXml/itemProps2.xml><?xml version="1.0" encoding="utf-8"?>
+<ds:datastoreItem xmlns:ds="http://schemas.openxmlformats.org/officeDocument/2006/customXml" ds:itemID="{C8C35155-3E6A-4058-B6E4-303717845E3B}">
+  <ds:schemaRefs>
+    <ds:schemaRef ds:uri="http://schemas.openxmlformats.org/officeDocument/2006/bibliography"/>
+  </ds:schemaRefs>
+</ds:datastoreItem>
+</file>
+
 <file path=customXml/itemProps3.xml><?xml version="1.0" encoding="utf-8"?>
+<ds:datastoreItem xmlns:ds="http://schemas.openxmlformats.org/officeDocument/2006/customXml" ds:itemID="{6C3F7A66-EDE3-46FD-83EB-3C265E5D2669}">
+  <ds:schemaRefs>
+    <ds:schemaRef ds:uri="http://schemas.microsoft.com/sharepoint/v3/contenttype/forms"/>
+  </ds:schemaRefs>
+</ds:datastoreItem>
+</file>
+
+<file path=customXml/itemProps4.xml><?xml version="1.0" encoding="utf-8"?>
 <ds:datastoreItem xmlns:ds="http://schemas.openxmlformats.org/officeDocument/2006/customXml" ds:itemID="{41546E4A-837A-4BEF-A4B8-FFD4EAB4E855}">
   <ds:schemaRefs>
     <ds:schemaRef ds:uri="http://schemas.microsoft.com/office/2006/metadata/contentType"/>
@@ -12438,12 +12477,4 @@
     <ds:schemaRef ds:uri="http://schemas.microsoft.com/internal/obd"/>
   </ds:schemaRefs>
 </ds:datastoreItem>
-</file>
-
-<file path=customXml/itemProps4.xml><?xml version="1.0" encoding="utf-8"?>
-<ds:datastoreItem xmlns:ds="http://schemas.openxmlformats.org/officeDocument/2006/customXml" ds:itemID="{6C3F7A66-EDE3-46FD-83EB-3C265E5D2669}">
-  <ds:schemaRefs>
-    <ds:schemaRef ds:uri="http://schemas.microsoft.com/sharepoint/v3/contenttype/forms"/>
-  </ds:schemaRefs>
-</ds:datastoreItem>
 </file>
</xml_diff>

<commit_message>
doc(rapport): Completion de la section du bilan
[25][WIP]
</commit_message>
<xml_diff>
--- a/doc/R-P_FUN-gillhorset-RapportProjet.docx
+++ b/doc/R-P_FUN-gillhorset-RapportProjet.docx
@@ -21,31 +21,7 @@
           <w:sz w:val="52"/>
           <w:szCs w:val="52"/>
         </w:rPr>
-        <w:t>P_FUN-</w:t>
-      </w:r>
-      <w:proofErr w:type="spellStart"/>
-      <w:r>
-        <w:rPr>
-          <w:rFonts w:asciiTheme="majorHAnsi" w:eastAsiaTheme="majorEastAsia" w:hAnsiTheme="majorHAnsi" w:cstheme="majorBidi"/>
-          <w:color w:val="17365D" w:themeColor="text2" w:themeShade="BF"/>
-          <w:spacing w:val="5"/>
-          <w:kern w:val="28"/>
-          <w:sz w:val="52"/>
-          <w:szCs w:val="52"/>
-        </w:rPr>
-        <w:t>ProgrammationFonctionnelle</w:t>
-      </w:r>
-      <w:proofErr w:type="spellEnd"/>
-      <w:r>
-        <w:rPr>
-          <w:rFonts w:asciiTheme="majorHAnsi" w:eastAsiaTheme="majorEastAsia" w:hAnsiTheme="majorHAnsi" w:cstheme="majorBidi"/>
-          <w:color w:val="17365D" w:themeColor="text2" w:themeShade="BF"/>
-          <w:spacing w:val="5"/>
-          <w:kern w:val="28"/>
-          <w:sz w:val="52"/>
-          <w:szCs w:val="52"/>
-        </w:rPr>
-        <w:t xml:space="preserve"> </w:t>
+        <w:t xml:space="preserve">P_FUN-ProgrammationFonctionnelle </w:t>
       </w:r>
       <w:r>
         <w:rPr>
@@ -55,9 +31,9 @@
           <w:szCs w:val="22"/>
         </w:rPr>
         <w:drawing>
-          <wp:inline distT="0" distB="0" distL="0" distR="0" wp14:anchorId="25778321" wp14:editId="74EE49F3">
-            <wp:extent cx="3134995" cy="2558415"/>
-            <wp:effectExtent l="19050" t="0" r="8255" b="0"/>
+          <wp:inline distT="0" distB="0" distL="0" distR="0" wp14:anchorId="25778321" wp14:editId="3FF545B8">
+            <wp:extent cx="2558415" cy="2558415"/>
+            <wp:effectExtent l="0" t="0" r="0" b="0"/>
             <wp:docPr id="3" name="Image 3"/>
             <wp:cNvGraphicFramePr>
               <a:graphicFrameLocks xmlns:a="http://schemas.openxmlformats.org/drawingml/2006/main" noChangeAspect="1"/>
@@ -66,14 +42,19 @@
               <a:graphicData uri="http://schemas.openxmlformats.org/drawingml/2006/picture">
                 <pic:pic xmlns:pic="http://schemas.openxmlformats.org/drawingml/2006/picture">
                   <pic:nvPicPr>
-                    <pic:cNvPr id="0" name="Picture 3"/>
+                    <pic:cNvPr id="3" name="Image 3"/>
                     <pic:cNvPicPr>
                       <a:picLocks noChangeAspect="1" noChangeArrowheads="1"/>
                     </pic:cNvPicPr>
                   </pic:nvPicPr>
                   <pic:blipFill>
-                    <a:blip r:embed="rId11" cstate="print"/>
-                    <a:srcRect/>
+                    <a:blip r:embed="rId11">
+                      <a:extLst>
+                        <a:ext uri="{28A0092B-C50C-407E-A947-70E740481C1C}">
+                          <a14:useLocalDpi xmlns:a14="http://schemas.microsoft.com/office/drawing/2010/main" val="0"/>
+                        </a:ext>
+                      </a:extLst>
+                    </a:blip>
                     <a:stretch>
                       <a:fillRect/>
                     </a:stretch>
@@ -81,7 +62,7 @@
                   <pic:spPr bwMode="auto">
                     <a:xfrm>
                       <a:off x="0" y="0"/>
-                      <a:ext cx="3134995" cy="2558415"/>
+                      <a:ext cx="2558415" cy="2558415"/>
                     </a:xfrm>
                     <a:prstGeom prst="rect">
                       <a:avLst/>
@@ -3204,26 +3185,21 @@
       <w:pPr>
         <w:pStyle w:val="Titre2"/>
       </w:pPr>
-      <w:bookmarkStart w:id="3" w:name="_Toc532179969"/>
-      <w:bookmarkStart w:id="4" w:name="_Toc165969639"/>
-      <w:bookmarkStart w:id="5" w:name="_Toc242091914"/>
+      <w:bookmarkStart w:id="3" w:name="_Toc242091914"/>
+      <w:bookmarkStart w:id="4" w:name="_Toc532179969"/>
+      <w:bookmarkStart w:id="5" w:name="_Toc165969639"/>
       <w:r>
         <w:t>Introduction</w:t>
       </w:r>
-      <w:bookmarkEnd w:id="5"/>
+      <w:bookmarkEnd w:id="3"/>
     </w:p>
     <w:p>
       <w:pPr>
         <w:pStyle w:val="Retraitcorpsdetexte"/>
       </w:pPr>
       <w:r>
-        <w:t xml:space="preserve">Le projet consiste en une application capable d’afficher des sets de données sur un graphique. La technologie utilisée sera du C# avec </w:t>
-      </w:r>
-      <w:proofErr w:type="spellStart"/>
-      <w:r>
-        <w:t>LinQ</w:t>
-      </w:r>
-      <w:proofErr w:type="spellEnd"/>
+        <w:t>Le projet consiste en une application capable d’afficher des sets de données sur un graphique. La technologie utilisée sera du C# avec LinQ</w:t>
+      </w:r>
       <w:r>
         <w:t>, afin d’apprendre la programmation fonctionnelle</w:t>
       </w:r>
@@ -3566,21 +3542,7 @@
         <w:rPr>
           <w:rFonts w:ascii="Arial" w:hAnsi="Arial" w:cs="Arial"/>
         </w:rPr>
-        <w:t xml:space="preserve">La fenêtre </w:t>
-      </w:r>
-      <w:proofErr w:type="spellStart"/>
-      <w:r>
-        <w:rPr>
-          <w:rFonts w:ascii="Arial" w:hAnsi="Arial" w:cs="Arial"/>
-        </w:rPr>
-        <w:t>pricipale</w:t>
-      </w:r>
-      <w:proofErr w:type="spellEnd"/>
-      <w:r>
-        <w:rPr>
-          <w:rFonts w:ascii="Arial" w:hAnsi="Arial" w:cs="Arial"/>
-        </w:rPr>
-        <w:t xml:space="preserve"> avec un graphique par défaut est affiché</w:t>
+        <w:t>La fenêtre pricipale avec un graphique par défaut est affiché</w:t>
       </w:r>
     </w:p>
     <w:p>
@@ -3668,21 +3630,7 @@
         <w:rPr>
           <w:rFonts w:ascii="Arial" w:hAnsi="Arial" w:cs="Arial"/>
         </w:rPr>
-        <w:t xml:space="preserve">•   </w:t>
-      </w:r>
-      <w:proofErr w:type="spellStart"/>
-      <w:r>
-        <w:rPr>
-          <w:rFonts w:ascii="Arial" w:hAnsi="Arial" w:cs="Arial"/>
-        </w:rPr>
-        <w:t>Losque</w:t>
-      </w:r>
-      <w:proofErr w:type="spellEnd"/>
-      <w:r>
-        <w:rPr>
-          <w:rFonts w:ascii="Arial" w:hAnsi="Arial" w:cs="Arial"/>
-        </w:rPr>
-        <w:t xml:space="preserve"> j'appuis sur le bouton "Importer"</w:t>
+        <w:t>•   Losque j'appuis sur le bouton "Importer"</w:t>
       </w:r>
     </w:p>
     <w:p>
@@ -3787,76 +3735,40 @@
         <w:rPr>
           <w:rFonts w:ascii="Arial" w:hAnsi="Arial" w:cs="Arial"/>
         </w:rPr>
-        <w:t xml:space="preserve">•   Dans la boite de dialogue ouverte seul les fichiers au format JSON sont </w:t>
-      </w:r>
-      <w:proofErr w:type="spellStart"/>
-      <w:r>
-        <w:rPr>
-          <w:rFonts w:ascii="Arial" w:hAnsi="Arial" w:cs="Arial"/>
-        </w:rPr>
-        <w:t>selectionnable</w:t>
-      </w:r>
-      <w:proofErr w:type="spellEnd"/>
-      <w:r>
-        <w:rPr>
-          <w:rFonts w:ascii="Arial" w:hAnsi="Arial" w:cs="Arial"/>
-        </w:rPr>
-        <w:t>.</w:t>
-      </w:r>
-    </w:p>
-    <w:p>
-      <w:pPr>
-        <w:rPr>
-          <w:rFonts w:ascii="Arial" w:hAnsi="Arial" w:cs="Arial"/>
-        </w:rPr>
-      </w:pPr>
-    </w:p>
-    <w:p>
-      <w:pPr>
-        <w:rPr>
-          <w:rFonts w:ascii="Arial" w:hAnsi="Arial" w:cs="Arial"/>
-        </w:rPr>
-      </w:pPr>
-      <w:r>
-        <w:rPr>
-          <w:rFonts w:ascii="Arial" w:hAnsi="Arial" w:cs="Arial"/>
-        </w:rPr>
-        <w:t xml:space="preserve">•   Si le fichier sélectionné est dans </w:t>
-      </w:r>
-      <w:proofErr w:type="gramStart"/>
-      <w:r>
-        <w:rPr>
-          <w:rFonts w:ascii="Arial" w:hAnsi="Arial" w:cs="Arial"/>
-        </w:rPr>
-        <w:t>un format incorrecte</w:t>
-      </w:r>
-      <w:proofErr w:type="gramEnd"/>
-    </w:p>
-    <w:p>
-      <w:pPr>
-        <w:rPr>
-          <w:rFonts w:ascii="Arial" w:hAnsi="Arial" w:cs="Arial"/>
-        </w:rPr>
-      </w:pPr>
-      <w:r>
-        <w:rPr>
-          <w:rFonts w:ascii="Arial" w:hAnsi="Arial" w:cs="Arial"/>
-        </w:rPr>
-        <w:t xml:space="preserve">Alors une nouvelle boite de dialogue s'ouvre pour informer l'utilisateur que le format du fichier est </w:t>
-      </w:r>
-      <w:proofErr w:type="gramStart"/>
-      <w:r>
-        <w:rPr>
-          <w:rFonts w:ascii="Arial" w:hAnsi="Arial" w:cs="Arial"/>
-        </w:rPr>
-        <w:t>incorrecte</w:t>
-      </w:r>
-      <w:proofErr w:type="gramEnd"/>
-      <w:r>
-        <w:rPr>
-          <w:rFonts w:ascii="Arial" w:hAnsi="Arial" w:cs="Arial"/>
-        </w:rPr>
-        <w:t xml:space="preserve"> et qu'il n'a pas été importé.</w:t>
+        <w:t>•   Dans la boite de dialogue ouverte seul les fichiers au format JSON sont selectionnable.</w:t>
+      </w:r>
+    </w:p>
+    <w:p>
+      <w:pPr>
+        <w:rPr>
+          <w:rFonts w:ascii="Arial" w:hAnsi="Arial" w:cs="Arial"/>
+        </w:rPr>
+      </w:pPr>
+    </w:p>
+    <w:p>
+      <w:pPr>
+        <w:rPr>
+          <w:rFonts w:ascii="Arial" w:hAnsi="Arial" w:cs="Arial"/>
+        </w:rPr>
+      </w:pPr>
+      <w:r>
+        <w:rPr>
+          <w:rFonts w:ascii="Arial" w:hAnsi="Arial" w:cs="Arial"/>
+        </w:rPr>
+        <w:t>•   Si le fichier sélectionné est dans un format incorrecte</w:t>
+      </w:r>
+    </w:p>
+    <w:p>
+      <w:pPr>
+        <w:rPr>
+          <w:rFonts w:ascii="Arial" w:hAnsi="Arial" w:cs="Arial"/>
+        </w:rPr>
+      </w:pPr>
+      <w:r>
+        <w:rPr>
+          <w:rFonts w:ascii="Arial" w:hAnsi="Arial" w:cs="Arial"/>
+        </w:rPr>
+        <w:t>Alors une nouvelle boite de dialogue s'ouvre pour informer l'utilisateur que le format du fichier est incorrecte et qu'il n'a pas été importé.</w:t>
       </w:r>
     </w:p>
     <w:p>
@@ -3922,30 +3834,8 @@
         <w:rPr>
           <w:rFonts w:ascii="Arial" w:hAnsi="Arial" w:cs="Arial"/>
         </w:rPr>
-        <w:t xml:space="preserve">Alors une boite de dialogue indique que des données ont été écrasé au </w:t>
-      </w:r>
-      <w:proofErr w:type="spellStart"/>
-      <w:r>
-        <w:rPr>
-          <w:rFonts w:ascii="Arial" w:hAnsi="Arial" w:cs="Arial"/>
-        </w:rPr>
-        <w:t>profi</w:t>
-      </w:r>
-      <w:proofErr w:type="spellEnd"/>
-      <w:r>
-        <w:rPr>
-          <w:rFonts w:ascii="Arial" w:hAnsi="Arial" w:cs="Arial"/>
-        </w:rPr>
-        <w:t xml:space="preserve"> </w:t>
-      </w:r>
-      <w:proofErr w:type="gramStart"/>
-      <w:r>
-        <w:rPr>
-          <w:rFonts w:ascii="Arial" w:hAnsi="Arial" w:cs="Arial"/>
-        </w:rPr>
-        <w:t>des données nouvellement importé</w:t>
-      </w:r>
-      <w:proofErr w:type="gramEnd"/>
+        <w:t>Alors une boite de dialogue indique que des données ont été écrasé au profi des données nouvellement importé</w:t>
+      </w:r>
     </w:p>
     <w:p>
       <w:pPr>
@@ -4008,21 +3898,7 @@
         <w:rPr>
           <w:rFonts w:ascii="Arial" w:hAnsi="Arial" w:cs="Arial"/>
         </w:rPr>
-        <w:t xml:space="preserve">Afin de </w:t>
-      </w:r>
-      <w:proofErr w:type="gramStart"/>
-      <w:r>
-        <w:rPr>
-          <w:rFonts w:ascii="Arial" w:hAnsi="Arial" w:cs="Arial"/>
-        </w:rPr>
-        <w:t>précisé</w:t>
-      </w:r>
-      <w:proofErr w:type="gramEnd"/>
-      <w:r>
-        <w:rPr>
-          <w:rFonts w:ascii="Arial" w:hAnsi="Arial" w:cs="Arial"/>
-        </w:rPr>
-        <w:t xml:space="preserve"> le graphique sur une échelle de temps</w:t>
+        <w:t>Afin de précisé le graphique sur une échelle de temps</w:t>
       </w:r>
     </w:p>
     <w:p>
@@ -4367,21 +4243,7 @@
         <w:rPr>
           <w:rFonts w:ascii="Arial" w:hAnsi="Arial" w:cs="Arial"/>
         </w:rPr>
-        <w:t xml:space="preserve">•   Étant donné que j'ai </w:t>
-      </w:r>
-      <w:proofErr w:type="spellStart"/>
-      <w:r>
-        <w:rPr>
-          <w:rFonts w:ascii="Arial" w:hAnsi="Arial" w:cs="Arial"/>
-        </w:rPr>
-        <w:t>précédement</w:t>
-      </w:r>
-      <w:proofErr w:type="spellEnd"/>
-      <w:r>
-        <w:rPr>
-          <w:rFonts w:ascii="Arial" w:hAnsi="Arial" w:cs="Arial"/>
-        </w:rPr>
-        <w:t xml:space="preserve"> importer des graphiques</w:t>
+        <w:t>•   Étant donné que j'ai précédement importer des graphiques</w:t>
       </w:r>
     </w:p>
     <w:p>
@@ -4407,16 +4269,8 @@
         <w:rPr>
           <w:rFonts w:ascii="Arial" w:hAnsi="Arial" w:cs="Arial"/>
         </w:rPr>
-        <w:t xml:space="preserve">Alors une liste déroulante constitué </w:t>
-      </w:r>
-      <w:proofErr w:type="gramStart"/>
-      <w:r>
-        <w:rPr>
-          <w:rFonts w:ascii="Arial" w:hAnsi="Arial" w:cs="Arial"/>
-        </w:rPr>
-        <w:t>des graphique</w:t>
-      </w:r>
-      <w:proofErr w:type="gramEnd"/>
+        <w:t>Alors une liste déroulante constitué des graphique</w:t>
+      </w:r>
     </w:p>
     <w:p>
       <w:pPr>
@@ -4567,30 +4421,8 @@
         <w:rPr>
           <w:rFonts w:ascii="Arial" w:hAnsi="Arial" w:cs="Arial"/>
         </w:rPr>
-        <w:t xml:space="preserve">•   </w:t>
-      </w:r>
-      <w:proofErr w:type="spellStart"/>
-      <w:r>
-        <w:rPr>
-          <w:rFonts w:ascii="Arial" w:hAnsi="Arial" w:cs="Arial"/>
-        </w:rPr>
-        <w:t>Losque</w:t>
-      </w:r>
-      <w:proofErr w:type="spellEnd"/>
-      <w:r>
-        <w:rPr>
-          <w:rFonts w:ascii="Arial" w:hAnsi="Arial" w:cs="Arial"/>
-        </w:rPr>
-        <w:t xml:space="preserve"> j'appuis sur le bouton de </w:t>
-      </w:r>
-      <w:proofErr w:type="spellStart"/>
-      <w:r>
-        <w:rPr>
-          <w:rFonts w:ascii="Arial" w:hAnsi="Arial" w:cs="Arial"/>
-        </w:rPr>
-        <w:t>zoomin</w:t>
-      </w:r>
-      <w:proofErr w:type="spellEnd"/>
+        <w:t>•   Losque j'appuis sur le bouton de zoomin</w:t>
+      </w:r>
     </w:p>
     <w:p>
       <w:pPr>
@@ -4622,21 +4454,7 @@
         <w:rPr>
           <w:rFonts w:ascii="Arial" w:hAnsi="Arial" w:cs="Arial"/>
         </w:rPr>
-        <w:t xml:space="preserve">•   </w:t>
-      </w:r>
-      <w:proofErr w:type="spellStart"/>
-      <w:r>
-        <w:rPr>
-          <w:rFonts w:ascii="Arial" w:hAnsi="Arial" w:cs="Arial"/>
-        </w:rPr>
-        <w:t>Losque</w:t>
-      </w:r>
-      <w:proofErr w:type="spellEnd"/>
-      <w:r>
-        <w:rPr>
-          <w:rFonts w:ascii="Arial" w:hAnsi="Arial" w:cs="Arial"/>
-        </w:rPr>
-        <w:t xml:space="preserve"> j'appuis sur le bouton de zoom out</w:t>
+        <w:t>•   Losque j'appuis sur le bouton de zoom out</w:t>
       </w:r>
     </w:p>
     <w:p>
@@ -4774,21 +4592,7 @@
         <w:rPr>
           <w:rFonts w:ascii="Arial" w:hAnsi="Arial" w:cs="Arial"/>
         </w:rPr>
-        <w:t xml:space="preserve">•   Si en </w:t>
-      </w:r>
-      <w:proofErr w:type="spellStart"/>
-      <w:r>
-        <w:rPr>
-          <w:rFonts w:ascii="Arial" w:hAnsi="Arial" w:cs="Arial"/>
-        </w:rPr>
-        <w:t>déplaçent</w:t>
-      </w:r>
-      <w:proofErr w:type="spellEnd"/>
-      <w:r>
-        <w:rPr>
-          <w:rFonts w:ascii="Arial" w:hAnsi="Arial" w:cs="Arial"/>
-        </w:rPr>
-        <w:t xml:space="preserve"> trop le graphique je sors de sa zone de départ ou de fin,</w:t>
+        <w:t>•   Si en déplaçent trop le graphique je sors de sa zone de départ ou de fin,</w:t>
       </w:r>
     </w:p>
     <w:p>
@@ -5077,18 +4881,10 @@
         <w:pStyle w:val="Informations"/>
       </w:pPr>
       <w:r>
-        <w:t xml:space="preserve">Objectifs </w:t>
-      </w:r>
-      <w:proofErr w:type="spellStart"/>
-      <w:r>
-        <w:t>complémentaires</w:t>
-      </w:r>
-      <w:r>
-        <w:t>au</w:t>
-      </w:r>
-      <w:proofErr w:type="spellEnd"/>
-      <w:r>
-        <w:t xml:space="preserve"> cas où le projet n’est pas assez ambitieux dans le temps imparti</w:t>
+        <w:t>Objectifs complémentaires</w:t>
+      </w:r>
+      <w:r>
+        <w:t>au cas où le projet n’est pas assez ambitieux dans le temps imparti</w:t>
       </w:r>
       <w:r>
         <w:t xml:space="preserve">… </w:t>
@@ -5157,8 +4953,8 @@
       <w:r>
         <w:t>Planification</w:t>
       </w:r>
-      <w:bookmarkEnd w:id="3"/>
       <w:bookmarkEnd w:id="4"/>
+      <w:bookmarkEnd w:id="5"/>
       <w:r>
         <w:t xml:space="preserve"> Initiale</w:t>
       </w:r>
@@ -5183,6 +4979,9 @@
           <w:p>
             <w:r>
               <w:t>Semaine 3</w:t>
+            </w:r>
+            <w:r>
+              <w:t xml:space="preserve"> (07.09.2026</w:t>
             </w:r>
           </w:p>
         </w:tc>
@@ -5206,6 +5005,9 @@
             <w:r>
               <w:t>Semaine 4</w:t>
             </w:r>
+            <w:r>
+              <w:t xml:space="preserve"> (14.09.2026)</w:t>
+            </w:r>
           </w:p>
         </w:tc>
         <w:tc>
@@ -5226,7 +5028,16 @@
           </w:tcPr>
           <w:p>
             <w:r>
-              <w:t>Semaine 5 - 6</w:t>
+              <w:t xml:space="preserve">Semaine 5 </w:t>
+            </w:r>
+            <w:r>
+              <w:t>–</w:t>
+            </w:r>
+            <w:r>
+              <w:t xml:space="preserve"> 6</w:t>
+            </w:r>
+            <w:r>
+              <w:t xml:space="preserve"> (14.09.2026 – 28.09.2026)</w:t>
             </w:r>
           </w:p>
         </w:tc>
@@ -5249,6 +5060,18 @@
           <w:p>
             <w:r>
               <w:t>Semaine 7</w:t>
+            </w:r>
+            <w:r>
+              <w:t xml:space="preserve"> </w:t>
+            </w:r>
+            <w:r>
+              <w:t>(</w:t>
+            </w:r>
+            <w:r>
+              <w:t>05</w:t>
+            </w:r>
+            <w:r>
+              <w:t>.10.2026)</w:t>
             </w:r>
           </w:p>
         </w:tc>
@@ -5290,6 +5113,9 @@
             <w:r>
               <w:t>Semaine 8</w:t>
             </w:r>
+            <w:r>
+              <w:t xml:space="preserve"> (26.10.2026)</w:t>
+            </w:r>
           </w:p>
         </w:tc>
         <w:tc>
@@ -5555,15 +5381,7 @@
         </w:numPr>
       </w:pPr>
       <w:r>
-        <w:t xml:space="preserve">Schémas de navigation, schémas événementiels, </w:t>
-      </w:r>
-      <w:proofErr w:type="spellStart"/>
-      <w:r>
-        <w:t>structogramme</w:t>
-      </w:r>
-      <w:proofErr w:type="spellEnd"/>
-      <w:r>
-        <w:t xml:space="preserve">, </w:t>
+        <w:t xml:space="preserve">Schémas de navigation, schémas événementiels, structogramme, </w:t>
       </w:r>
       <w:r>
         <w:t>pseudocode</w:t>
@@ -5614,15 +5432,7 @@
         </w:numPr>
       </w:pPr>
       <w:r>
-        <w:t xml:space="preserve">Modèle conceptuel des données, </w:t>
-      </w:r>
-      <w:proofErr w:type="gramStart"/>
-      <w:r>
-        <w:t>modèles logique</w:t>
-      </w:r>
-      <w:proofErr w:type="gramEnd"/>
-      <w:r>
-        <w:t xml:space="preserve"> des données.</w:t>
+        <w:t>Modèle conceptuel des données, modèles logique des données.</w:t>
       </w:r>
     </w:p>
     <w:p>
@@ -5688,8 +5498,8 @@
       <w:pPr>
         <w:pStyle w:val="Titre2"/>
       </w:pPr>
-      <w:bookmarkStart w:id="26" w:name="_Toc532179961"/>
-      <w:bookmarkStart w:id="27" w:name="_Toc242091929"/>
+      <w:bookmarkStart w:id="26" w:name="_Toc242091929"/>
+      <w:bookmarkStart w:id="27" w:name="_Toc532179961"/>
       <w:r>
         <w:t>Planification</w:t>
       </w:r>
@@ -5699,7 +5509,7 @@
       <w:r>
         <w:t>e</w:t>
       </w:r>
-      <w:bookmarkEnd w:id="27"/>
+      <w:bookmarkEnd w:id="26"/>
     </w:p>
     <w:p>
       <w:pPr>
@@ -5738,7 +5548,7 @@
       <w:bookmarkStart w:id="28" w:name="_Toc532179964"/>
       <w:bookmarkStart w:id="29" w:name="_Toc165969648"/>
       <w:bookmarkStart w:id="30" w:name="_Toc242091930"/>
-      <w:bookmarkEnd w:id="26"/>
+      <w:bookmarkEnd w:id="27"/>
       <w:r>
         <w:t>Réalisation</w:t>
       </w:r>
@@ -6041,13 +5851,8 @@
           <w:numId w:val="22"/>
         </w:numPr>
       </w:pPr>
-      <w:proofErr w:type="gramStart"/>
-      <w:r>
-        <w:t>raison</w:t>
-      </w:r>
-      <w:proofErr w:type="gramEnd"/>
-      <w:r>
-        <w:t>, décisions, etc.</w:t>
+      <w:r>
+        <w:t>raison, décisions, etc.</w:t>
       </w:r>
     </w:p>
     <w:p>
@@ -6059,13 +5864,8 @@
         </w:numPr>
       </w:pPr>
       <w:r>
-        <w:t xml:space="preserve">Liste des bugs répertoriés avec la date de découverte et leur </w:t>
-      </w:r>
-      <w:proofErr w:type="gramStart"/>
-      <w:r>
-        <w:t>état:</w:t>
-      </w:r>
-      <w:proofErr w:type="gramEnd"/>
+        <w:t>Liste des bugs répertoriés avec la date de découverte et leur état:</w:t>
+      </w:r>
     </w:p>
     <w:p>
       <w:pPr>
@@ -6114,35 +5914,88 @@
     </w:p>
     <w:p>
       <w:pPr>
-        <w:pStyle w:val="Informations"/>
-        <w:numPr>
-          <w:ilvl w:val="5"/>
-          <w:numId w:val="23"/>
-        </w:numPr>
-      </w:pPr>
-      <w:r>
-        <w:t xml:space="preserve">Il s’agit de reprendre point par point les fonctionnalités décrites dans les spécifications de départ </w:t>
-      </w:r>
-      <w:r>
-        <w:t>et de définir si elles sont atteintes ou pas, et pourquoi.</w:t>
-      </w:r>
-    </w:p>
-    <w:p>
-      <w:pPr>
-        <w:pStyle w:val="Informations"/>
-        <w:numPr>
-          <w:ilvl w:val="5"/>
-          <w:numId w:val="23"/>
-        </w:numPr>
-      </w:pPr>
-      <w:r>
-        <w:t>Si ce n’est pas le cas, estimer</w:t>
-      </w:r>
-      <w:r>
-        <w:t xml:space="preserve"> en « % » ou en « temps supplémentaire » </w:t>
-      </w:r>
-      <w:r>
-        <w:t>le travail qu’il reste à accomplir pour terminer le tout.</w:t>
+        <w:pStyle w:val="Retraitcorpsdetexte"/>
+      </w:pPr>
+      <w:r>
+        <w:t>Dans le projet la majorité des fonctionnalités prévu à l’origine ont été implémentés et sont fonctionnelles.</w:t>
+      </w:r>
+    </w:p>
+    <w:p>
+      <w:pPr>
+        <w:pStyle w:val="Retraitcorpsdetexte"/>
+      </w:pPr>
+      <w:r>
+        <w:t>L’utilisateur peut charger des données, elles sont traitées</w:t>
+      </w:r>
+      <w:r>
+        <w:t>,</w:t>
+      </w:r>
+      <w:r>
+        <w:t xml:space="preserve"> s’il y a des données en doublon, elles écrasent les précédentes</w:t>
+      </w:r>
+      <w:r>
+        <w:t>, s’il y a des données incorrecte l’utilisateur est prévenu et l’importation s’annule</w:t>
+      </w:r>
+      <w:r>
+        <w:t>.</w:t>
+      </w:r>
+      <w:r>
+        <w:t xml:space="preserve"> J’ai très largement sous-estimé ce point, je pensais pouvoir le réaliser en deux semaines, mais il m’en a fallu 4. Lors de l’importation l’utilisateur doit </w:t>
+      </w:r>
+      <w:r>
+        <w:t>entrer</w:t>
+      </w:r>
+      <w:r>
+        <w:t xml:space="preserve"> un titre pour le graphique, cela n’était pas prévu à l’origine et à été changer en cours de route lorsque j’ai réalisé qu’il n’était pas possible de </w:t>
+      </w:r>
+      <w:r>
+        <w:t>récupérer un titre pertinent directement des données importées. Cela était une erreur, j’aurait dû au minimum en parler au chef de projet avant de changer cette user storie.</w:t>
+      </w:r>
+    </w:p>
+    <w:p>
+      <w:pPr>
+        <w:pStyle w:val="Retraitcorpsdetexte"/>
+      </w:pPr>
+      <w:r>
+        <w:t>Le graphique s’affiche correctement et dynamiquement (lors de l’import de données). Dans un souci de lisibilité des graphique, l’application permet l’affichage simultané de 5 graphiques maximum, sinon quoi il retire en retire pour que le nombre corresponde.</w:t>
+      </w:r>
+    </w:p>
+    <w:p>
+      <w:pPr>
+        <w:pStyle w:val="Retraitcorpsdetexte"/>
+      </w:pPr>
+      <w:r>
+        <w:t xml:space="preserve">L’utilisateur </w:t>
+      </w:r>
+      <w:r>
+        <w:t>à la capacité de se déplacer dans l’espace des graphiques. Je pensais avoir à le coder plus ou moins à la main, mais la librairie ScottPlot l’intègre nativement.</w:t>
+      </w:r>
+    </w:p>
+    <w:p>
+      <w:pPr>
+        <w:pStyle w:val="Retraitcorpsdetexte"/>
+      </w:pPr>
+      <w:r>
+        <w:t xml:space="preserve">Les graphiques importés ont un titre et une légende </w:t>
+      </w:r>
+      <w:r>
+        <w:t>donné par l’utilisateur lors de l’importation du graphique.</w:t>
+      </w:r>
+    </w:p>
+    <w:p>
+      <w:pPr>
+        <w:pStyle w:val="Retraitcorpsdetexte"/>
+      </w:pPr>
+      <w:r>
+        <w:t>L’utilisateur a la possibilité de changer de graphique comme prévu.</w:t>
+      </w:r>
+    </w:p>
+    <w:p>
+      <w:pPr>
+        <w:pStyle w:val="Retraitcorpsdetexte"/>
+      </w:pPr>
+      <w:r>
+        <w:t>A l’origine il y avait été prévu un affichage par date // TODO : à completer</w:t>
       </w:r>
     </w:p>
     <w:p>
@@ -6186,7 +6039,13 @@
         <w:pStyle w:val="Retraitcorpsdetexte"/>
       </w:pPr>
       <w:r>
-        <w:t xml:space="preserve">En ce qui concerne la troisième semaine, je n’avais pas prévu ça, mais le 21 septembre était le lundi du jeune, donc je n’ai pas </w:t>
+        <w:t>En ce qui concerne la troisième semaine, je n’avais pas prévu ça</w:t>
+      </w:r>
+      <w:r>
+        <w:t xml:space="preserve"> dans ma planification</w:t>
+      </w:r>
+      <w:r>
+        <w:t xml:space="preserve">, mais le 21 septembre était le lundi du jeune, donc je n’ai pas </w:t>
       </w:r>
       <w:r>
         <w:t>travaillé</w:t>
@@ -6200,7 +6059,11 @@
         <w:pStyle w:val="Retraitcorpsdetexte"/>
       </w:pPr>
       <w:r>
-        <w:t>Pour la quatrième semaine j’ai commencé par travailler sur la fin de l’importation des données et de leurs affichages puis je suis passé à l’affichage de la légende qui m’a pris moins de temps que prévu, donc j’ai pu le terminer dans la même semaine.</w:t>
+        <w:t xml:space="preserve">Pour la quatrième semaine j’ai commencé par travailler sur la fin de l’importation des données et de leurs affichages puis je suis passé à l’affichage de la légende </w:t>
+      </w:r>
+      <w:r>
+        <w:lastRenderedPageBreak/>
+        <w:t>qui m’a pris moins de temps que prévu, donc j’ai pu le terminer dans la même semaine.</w:t>
       </w:r>
     </w:p>
     <w:p>
@@ -6211,15 +6074,37 @@
         <w:t xml:space="preserve">Pour la cinquième semaine </w:t>
       </w:r>
       <w:r>
-        <w:t xml:space="preserve">j’ai réalisé qu’il y avait un problème lors de l’importation des données. J’avait mis dans mes </w:t>
-      </w:r>
-      <w:proofErr w:type="spellStart"/>
-      <w:r>
-        <w:t>users</w:t>
-      </w:r>
-      <w:proofErr w:type="spellEnd"/>
-      <w:r>
-        <w:t xml:space="preserve"> stories que les données importées en doublons écrasaient celle présente en DB. Point que j’ai passé toute la séance à corriger.</w:t>
+        <w:t>j’ai réalisé qu’il y avait un problème lors de l’importation des données. J’avait mis dans mes users stories que les données importées en doublons écrasaient celle présente en DB. Point que j’ai passé toute la séance à corriger.</w:t>
+      </w:r>
+    </w:p>
+    <w:p>
+      <w:pPr>
+        <w:pStyle w:val="Retraitcorpsdetexte"/>
+      </w:pPr>
+      <w:r>
+        <w:t xml:space="preserve">Durant la sixième semaine </w:t>
+      </w:r>
+      <w:r>
+        <w:t>j’ai travaillé comme prévu sur l’importation de données, mais je n’ai pas fini à temps et cela à débordé sur la septième semaine durant laquelle j’ai également exclusivement travailler sur l’importation des données.</w:t>
+      </w:r>
+    </w:p>
+    <w:p>
+      <w:pPr>
+        <w:pStyle w:val="Retraitcorpsdetexte"/>
+      </w:pPr>
+      <w:r>
+        <w:t xml:space="preserve">Entre la septième et la huitième semaine il y avait 2 semaines de vacances durant lesquelles j’ai un peu travailler. J’ai </w:t>
+      </w:r>
+      <w:r>
+        <w:t>terminé les derniers détails de l’importation des données puis j’ai ajout le système de changement de graphiques.</w:t>
+      </w:r>
+    </w:p>
+    <w:p>
+      <w:pPr>
+        <w:pStyle w:val="Retraitcorpsdetexte"/>
+      </w:pPr>
+      <w:r>
+        <w:t>La huitième semaine qui devais être dédier exclusivement à la documentation du projet à en réalité partagé avec la mise en place des testes unitaire, point que j’avais négligé dans ma planification.</w:t>
       </w:r>
     </w:p>
     <w:p>
@@ -6243,16 +6128,11 @@
         </w:numPr>
       </w:pPr>
       <w:r>
-        <w:t xml:space="preserve">Si c’était à </w:t>
-      </w:r>
-      <w:proofErr w:type="gramStart"/>
-      <w:r>
-        <w:t>refaire</w:t>
+        <w:t>Si c’était à refaire</w:t>
       </w:r>
       <w:r>
         <w:t>:</w:t>
       </w:r>
-      <w:proofErr w:type="gramEnd"/>
     </w:p>
     <w:p>
       <w:pPr>
@@ -6399,7 +6279,6 @@
       </w:pPr>
       <w:bookmarkStart w:id="58" w:name="_Toc242091941"/>
       <w:r>
-        <w:lastRenderedPageBreak/>
         <w:t>Bibliographie</w:t>
       </w:r>
       <w:bookmarkEnd w:id="58"/>
@@ -6953,21 +6832,12 @@
               <w:szCs w:val="16"/>
             </w:rPr>
           </w:pPr>
-          <w:proofErr w:type="gramStart"/>
           <w:r>
             <w:rPr>
               <w:rFonts w:cs="Arial"/>
               <w:szCs w:val="16"/>
             </w:rPr>
-            <w:t>Version:</w:t>
-          </w:r>
-          <w:proofErr w:type="gramEnd"/>
-          <w:r>
-            <w:rPr>
-              <w:rFonts w:cs="Arial"/>
-              <w:szCs w:val="16"/>
-            </w:rPr>
-            <w:t xml:space="preserve"> </w:t>
+            <w:t xml:space="preserve">Version: </w:t>
           </w:r>
           <w:fldSimple w:instr=" REVNUM   \* MERGEFORMAT ">
             <w:r>
@@ -7013,7 +6883,7 @@
               <w:noProof/>
               <w:szCs w:val="16"/>
             </w:rPr>
-            <w:t>04.09.2026 08:59</w:t>
+            <w:t>05.10.2026 11:25</w:t>
           </w:r>
           <w:r>
             <w:rPr>
@@ -12167,6 +12037,10 @@
 </file>
 
 <file path=customXml/item1.xml><?xml version="1.0" encoding="utf-8"?>
+<b:Sources xmlns:b="http://schemas.openxmlformats.org/officeDocument/2006/bibliography" xmlns="http://schemas.openxmlformats.org/officeDocument/2006/bibliography" SelectedStyle="\APA.XSL" StyleName="APA"/>
+</file>
+
+<file path=customXml/item2.xml><?xml version="1.0" encoding="utf-8"?>
 <p:properties xmlns:p="http://schemas.microsoft.com/office/2006/metadata/properties" xmlns:xsi="http://www.w3.org/2001/XMLSchema-instance" xmlns:pc="http://schemas.microsoft.com/office/infopath/2007/PartnerControls">
   <documentManagement>
     <lcf76f155ced4ddcb4097134ff3c332f xmlns="a1b10758-7132-46a4-a2fe-7a2cf46f51f4">
@@ -12177,20 +12051,7 @@
 </p:properties>
 </file>
 
-<file path=customXml/item2.xml><?xml version="1.0" encoding="utf-8"?>
-<b:Sources xmlns:b="http://schemas.openxmlformats.org/officeDocument/2006/bibliography" xmlns="http://schemas.openxmlformats.org/officeDocument/2006/bibliography" SelectedStyle="\APA.XSL" StyleName="APA"/>
-</file>
-
 <file path=customXml/item3.xml><?xml version="1.0" encoding="utf-8"?>
-<?mso-contentType ?>
-<FormTemplates xmlns="http://schemas.microsoft.com/sharepoint/v3/contenttype/forms">
-  <Display>DocumentLibraryForm</Display>
-  <Edit>DocumentLibraryForm</Edit>
-  <New>DocumentLibraryForm</New>
-</FormTemplates>
-</file>
-
-<file path=customXml/item4.xml><?xml version="1.0" encoding="utf-8"?>
 <ct:contentTypeSchema xmlns:ct="http://schemas.microsoft.com/office/2006/metadata/contentType" xmlns:ma="http://schemas.microsoft.com/office/2006/metadata/properties/metaAttributes" ct:_="" ma:_="" ma:contentTypeName="Document" ma:contentTypeID="0x0101005A5B8F5EAAC22C48A11F5D9A60E6F21D" ma:contentTypeVersion="16" ma:contentTypeDescription="Crée un document." ma:contentTypeScope="" ma:versionID="f2b963976306cc54294b7f4545a3c6c4">
   <xsd:schema xmlns:xsd="http://www.w3.org/2001/XMLSchema" xmlns:xs="http://www.w3.org/2001/XMLSchema" xmlns:p="http://schemas.microsoft.com/office/2006/metadata/properties" xmlns:ns2="a1b10758-7132-46a4-a2fe-7a2cf46f51f4" xmlns:ns3="f7d9f5a6-831d-4621-8c77-cbcaf993e406" targetNamespace="http://schemas.microsoft.com/office/2006/metadata/properties" ma:root="true" ma:fieldsID="e5e135fa2fc1295e1586ddcd9c1a8904" ns2:_="" ns3:_="">
     <xsd:import namespace="a1b10758-7132-46a4-a2fe-7a2cf46f51f4"/>
@@ -12433,7 +12294,24 @@
 </ct:contentTypeSchema>
 </file>
 
+<file path=customXml/item4.xml><?xml version="1.0" encoding="utf-8"?>
+<?mso-contentType ?>
+<FormTemplates xmlns="http://schemas.microsoft.com/sharepoint/v3/contenttype/forms">
+  <Display>DocumentLibraryForm</Display>
+  <Edit>DocumentLibraryForm</Edit>
+  <New>DocumentLibraryForm</New>
+</FormTemplates>
+</file>
+
 <file path=customXml/itemProps1.xml><?xml version="1.0" encoding="utf-8"?>
+<ds:datastoreItem xmlns:ds="http://schemas.openxmlformats.org/officeDocument/2006/customXml" ds:itemID="{C8C35155-3E6A-4058-B6E4-303717845E3B}">
+  <ds:schemaRefs>
+    <ds:schemaRef ds:uri="http://schemas.openxmlformats.org/officeDocument/2006/bibliography"/>
+  </ds:schemaRefs>
+</ds:datastoreItem>
+</file>
+
+<file path=customXml/itemProps2.xml><?xml version="1.0" encoding="utf-8"?>
 <ds:datastoreItem xmlns:ds="http://schemas.openxmlformats.org/officeDocument/2006/customXml" ds:itemID="{2319CDB8-A2CD-412D-8359-13E6B4DF1FF4}">
   <ds:schemaRefs>
     <ds:schemaRef ds:uri="http://schemas.microsoft.com/office/2006/metadata/properties"/>
@@ -12444,23 +12322,7 @@
 </ds:datastoreItem>
 </file>
 
-<file path=customXml/itemProps2.xml><?xml version="1.0" encoding="utf-8"?>
-<ds:datastoreItem xmlns:ds="http://schemas.openxmlformats.org/officeDocument/2006/customXml" ds:itemID="{C8C35155-3E6A-4058-B6E4-303717845E3B}">
-  <ds:schemaRefs>
-    <ds:schemaRef ds:uri="http://schemas.openxmlformats.org/officeDocument/2006/bibliography"/>
-  </ds:schemaRefs>
-</ds:datastoreItem>
-</file>
-
 <file path=customXml/itemProps3.xml><?xml version="1.0" encoding="utf-8"?>
-<ds:datastoreItem xmlns:ds="http://schemas.openxmlformats.org/officeDocument/2006/customXml" ds:itemID="{6C3F7A66-EDE3-46FD-83EB-3C265E5D2669}">
-  <ds:schemaRefs>
-    <ds:schemaRef ds:uri="http://schemas.microsoft.com/sharepoint/v3/contenttype/forms"/>
-  </ds:schemaRefs>
-</ds:datastoreItem>
-</file>
-
-<file path=customXml/itemProps4.xml><?xml version="1.0" encoding="utf-8"?>
 <ds:datastoreItem xmlns:ds="http://schemas.openxmlformats.org/officeDocument/2006/customXml" ds:itemID="{41546E4A-837A-4BEF-A4B8-FFD4EAB4E855}">
   <ds:schemaRefs>
     <ds:schemaRef ds:uri="http://schemas.microsoft.com/office/2006/metadata/contentType"/>
@@ -12477,4 +12339,12 @@
     <ds:schemaRef ds:uri="http://schemas.microsoft.com/internal/obd"/>
   </ds:schemaRefs>
 </ds:datastoreItem>
+</file>
+
+<file path=customXml/itemProps4.xml><?xml version="1.0" encoding="utf-8"?>
+<ds:datastoreItem xmlns:ds="http://schemas.openxmlformats.org/officeDocument/2006/customXml" ds:itemID="{6C3F7A66-EDE3-46FD-83EB-3C265E5D2669}">
+  <ds:schemaRefs>
+    <ds:schemaRef ds:uri="http://schemas.microsoft.com/sharepoint/v3/contenttype/forms"/>
+  </ds:schemaRefs>
+</ds:datastoreItem>
 </file>
</xml_diff>